<commit_message>
xoa file trung lap
</commit_message>
<xml_diff>
--- a/QLDA_Buoi11_NguyenHoTruongTam_1150080156/Nguyễn Hồ Trường Tam_1150080156_Buoi11.docx
+++ b/QLDA_Buoi11_NguyenHoTruongTam_1150080156/Nguyễn Hồ Trường Tam_1150080156_Buoi11.docx
@@ -3,11 +3,25 @@
 <w:document xmlns:wpc="http://schemas.microsoft.com/office/word/2010/wordprocessingCanvas" xmlns:cx="http://schemas.microsoft.com/office/drawing/2014/chartex" xmlns:cx1="http://schemas.microsoft.com/office/drawing/2015/9/8/chartex" xmlns:cx2="http://schemas.microsoft.com/office/drawing/2015/10/21/chartex" xmlns:cx3="http://schemas.microsoft.com/office/drawing/2016/5/9/chartex" xmlns:cx4="http://schemas.microsoft.com/office/drawing/2016/5/10/chartex" xmlns:cx5="http://schemas.microsoft.com/office/drawing/2016/5/11/chartex" xmlns:cx6="http://schemas.microsoft.com/office/drawing/2016/5/12/chartex" xmlns:cx7="http://schemas.microsoft.com/office/drawing/2016/5/13/chartex" xmlns:cx8="http://schemas.microsoft.com/office/drawing/2016/5/14/chartex" xmlns:mc="http://schemas.openxmlformats.org/markup-compatibility/2006" xmlns:aink="http://schemas.microsoft.com/office/drawing/2016/ink" xmlns:am3d="http://schemas.microsoft.com/office/drawing/2017/model3d" xmlns:o="urn:schemas-microsoft-com:office:office" xmlns:oel="http://schemas.microsoft.com/office/2019/extlst" xmlns:r="http://schemas.openxmlformats.org/officeDocument/2006/relationships" xmlns:m="http://schemas.openxmlformats.org/officeDocument/2006/math" xmlns:v="urn:schemas-microsoft-com:vml" xmlns:wp14="http://schemas.microsoft.com/office/word/2010/wordprocessingDrawing" xmlns:wp="http://schemas.openxmlformats.org/drawingml/2006/wordprocessingDrawing" xmlns:w10="urn:schemas-microsoft-com:office:word" xmlns:w="http://schemas.openxmlformats.org/wordprocessingml/2006/main" xmlns:w14="http://schemas.microsoft.com/office/word/2010/wordml" xmlns:w15="http://schemas.microsoft.com/office/word/2012/wordml" xmlns:w16cex="http://schemas.microsoft.com/office/word/2018/wordml/cex" xmlns:w16cid="http://schemas.microsoft.com/office/word/2016/wordml/cid" xmlns:w16="http://schemas.microsoft.com/office/word/2018/wordml" xmlns:w16du="http://schemas.microsoft.com/office/word/2023/wordml/word16du" xmlns:w16sdtdh="http://schemas.microsoft.com/office/word/2020/wordml/sdtdatahash" xmlns:w16sdtfl="http://schemas.microsoft.com/office/word/2024/wordml/sdtformatlock" xmlns:w16se="http://schemas.microsoft.com/office/word/2015/wordml/symex" xmlns:wpg="http://schemas.microsoft.com/office/word/2010/wordprocessingGroup" xmlns:wpi="http://schemas.microsoft.com/office/word/2010/wordprocessingInk" xmlns:wne="http://schemas.microsoft.com/office/word/2006/wordml" xmlns:wps="http://schemas.microsoft.com/office/word/2010/wordprocessingShape" mc:Ignorable="w14 w15 w16se w16cid w16 w16cex w16sdtdh w16sdtfl w16du wp14">
   <w:body>
     <w:p>
+      <w:pPr>
+        <w:pStyle w:val="Heading2"/>
+      </w:pPr>
+      <w:r>
+        <w:t>Nguyễn Hồ Trường Tam_1150080156_BTQLDA_Buoi11</w:t>
+      </w:r>
+    </w:p>
+    <w:p>
+      <w:pPr>
+        <w:pStyle w:val="Heading2"/>
+      </w:pPr>
       <w:r>
         <w:t>II</w:t>
       </w:r>
     </w:p>
     <w:p>
+      <w:pPr>
+        <w:pStyle w:val="Heading3"/>
+      </w:pPr>
       <w:r>
         <w:t>1.</w:t>
       </w:r>
@@ -19,6 +33,9 @@
     </w:p>
     <w:p>
       <w:r>
+        <w:rPr>
+          <w:noProof/>
+        </w:rPr>
         <w:drawing>
           <wp:inline distT="0" distB="0" distL="0" distR="0" wp14:anchorId="5E643EAF" wp14:editId="222CDAC1">
             <wp:extent cx="5731510" cy="868680"/>
@@ -35,7 +52,7 @@
                     <pic:cNvPicPr/>
                   </pic:nvPicPr>
                   <pic:blipFill>
-                    <a:blip r:embed="rId4"/>
+                    <a:blip r:embed="rId5"/>
                     <a:stretch>
                       <a:fillRect/>
                     </a:stretch>
@@ -63,6 +80,9 @@
     </w:p>
     <w:p>
       <w:r>
+        <w:rPr>
+          <w:noProof/>
+        </w:rPr>
         <w:drawing>
           <wp:inline distT="0" distB="0" distL="0" distR="0" wp14:anchorId="65118032" wp14:editId="11BDD4AF">
             <wp:extent cx="5731510" cy="607695"/>
@@ -79,7 +99,7 @@
                     <pic:cNvPicPr/>
                   </pic:nvPicPr>
                   <pic:blipFill>
-                    <a:blip r:embed="rId5"/>
+                    <a:blip r:embed="rId6"/>
                     <a:stretch>
                       <a:fillRect/>
                     </a:stretch>
@@ -102,19 +122,111 @@
     </w:p>
     <w:p>
       <w:r>
+        <w:t xml:space="preserve">Công thức NPV: </w:t>
+      </w:r>
+      <w:r>
+        <w:drawing>
+          <wp:inline distT="0" distB="0" distL="0" distR="0" wp14:anchorId="563B60B6" wp14:editId="189AE325">
+            <wp:extent cx="3229426" cy="724001"/>
+            <wp:effectExtent l="0" t="0" r="9525" b="0"/>
+            <wp:docPr id="2138954398" name="Picture 1" descr="A math equations and formulas&#10;&#10;AI-generated content may be incorrect."/>
+            <wp:cNvGraphicFramePr>
+              <a:graphicFrameLocks xmlns:a="http://schemas.openxmlformats.org/drawingml/2006/main" noChangeAspect="1"/>
+            </wp:cNvGraphicFramePr>
+            <a:graphic xmlns:a="http://schemas.openxmlformats.org/drawingml/2006/main">
+              <a:graphicData uri="http://schemas.openxmlformats.org/drawingml/2006/picture">
+                <pic:pic xmlns:pic="http://schemas.openxmlformats.org/drawingml/2006/picture">
+                  <pic:nvPicPr>
+                    <pic:cNvPr id="2138954398" name="Picture 1" descr="A math equations and formulas&#10;&#10;AI-generated content may be incorrect."/>
+                    <pic:cNvPicPr/>
+                  </pic:nvPicPr>
+                  <pic:blipFill>
+                    <a:blip r:embed="rId7"/>
+                    <a:stretch>
+                      <a:fillRect/>
+                    </a:stretch>
+                  </pic:blipFill>
+                  <pic:spPr>
+                    <a:xfrm>
+                      <a:off x="0" y="0"/>
+                      <a:ext cx="3229426" cy="724001"/>
+                    </a:xfrm>
+                    <a:prstGeom prst="rect">
+                      <a:avLst/>
+                    </a:prstGeom>
+                  </pic:spPr>
+                </pic:pic>
+              </a:graphicData>
+            </a:graphic>
+          </wp:inline>
+        </w:drawing>
+      </w:r>
+    </w:p>
+    <w:p>
+      <w:r>
         <w:t xml:space="preserve">NPV Project 2 &gt; Project 1 ($3612 &gt; $2316) =&gt; Chọn Project </w:t>
       </w:r>
       <w:r>
-        <w:t>2\</w:t>
-      </w:r>
-    </w:p>
-    <w:p>
+        <w:t>2</w:t>
+      </w:r>
+    </w:p>
+    <w:p>
+      <w:pPr>
+        <w:pStyle w:val="Heading3"/>
+      </w:pPr>
       <w:r>
         <w:t>2.</w:t>
       </w:r>
     </w:p>
     <w:p>
       <w:r>
+        <w:t>công thức tính Roi</w:t>
+      </w:r>
+    </w:p>
+    <w:p>
+      <w:r>
+        <w:drawing>
+          <wp:inline distT="0" distB="0" distL="0" distR="0" wp14:anchorId="24973C21" wp14:editId="370F5CE2">
+            <wp:extent cx="3648584" cy="495369"/>
+            <wp:effectExtent l="0" t="0" r="9525" b="0"/>
+            <wp:docPr id="851481897" name="Picture 1" descr="A black text on a white background&#10;&#10;AI-generated content may be incorrect."/>
+            <wp:cNvGraphicFramePr>
+              <a:graphicFrameLocks xmlns:a="http://schemas.openxmlformats.org/drawingml/2006/main" noChangeAspect="1"/>
+            </wp:cNvGraphicFramePr>
+            <a:graphic xmlns:a="http://schemas.openxmlformats.org/drawingml/2006/main">
+              <a:graphicData uri="http://schemas.openxmlformats.org/drawingml/2006/picture">
+                <pic:pic xmlns:pic="http://schemas.openxmlformats.org/drawingml/2006/picture">
+                  <pic:nvPicPr>
+                    <pic:cNvPr id="851481897" name="Picture 1" descr="A black text on a white background&#10;&#10;AI-generated content may be incorrect."/>
+                    <pic:cNvPicPr/>
+                  </pic:nvPicPr>
+                  <pic:blipFill>
+                    <a:blip r:embed="rId8"/>
+                    <a:stretch>
+                      <a:fillRect/>
+                    </a:stretch>
+                  </pic:blipFill>
+                  <pic:spPr>
+                    <a:xfrm>
+                      <a:off x="0" y="0"/>
+                      <a:ext cx="3648584" cy="495369"/>
+                    </a:xfrm>
+                    <a:prstGeom prst="rect">
+                      <a:avLst/>
+                    </a:prstGeom>
+                  </pic:spPr>
+                </pic:pic>
+              </a:graphicData>
+            </a:graphic>
+          </wp:inline>
+        </w:drawing>
+      </w:r>
+    </w:p>
+    <w:p>
+      <w:r>
+        <w:rPr>
+          <w:noProof/>
+        </w:rPr>
         <w:drawing>
           <wp:inline distT="0" distB="0" distL="0" distR="0" wp14:anchorId="40ED51CC" wp14:editId="34E86DA7">
             <wp:extent cx="5731510" cy="1901190"/>
@@ -131,7 +243,7 @@
                     <pic:cNvPicPr/>
                   </pic:nvPicPr>
                   <pic:blipFill>
-                    <a:blip r:embed="rId6"/>
+                    <a:blip r:embed="rId9"/>
                     <a:stretch>
                       <a:fillRect/>
                     </a:stretch>
@@ -154,11 +266,80 @@
     </w:p>
     <w:p>
       <w:r>
+        <w:t>=&gt;&gt;C</w:t>
+      </w:r>
+      <w:r>
+        <w:t xml:space="preserve">ứ 1$ chi ra thu thêm </w:t>
+      </w:r>
+      <w:r>
+        <w:rPr>
+          <w:b/>
+          <w:bCs/>
+        </w:rPr>
+        <w:t>1,12$</w:t>
+      </w:r>
+      <w:r>
+        <w:t xml:space="preserve"> lợi ích</w:t>
+      </w:r>
+    </w:p>
+    <w:p>
+      <w:pPr>
+        <w:pStyle w:val="Heading3"/>
+      </w:pPr>
+      <w:r>
         <w:t>3.</w:t>
       </w:r>
     </w:p>
     <w:p>
       <w:r>
+        <w:t>Công thức tính</w:t>
+      </w:r>
+    </w:p>
+    <w:p>
+      <w:r>
+        <w:lastRenderedPageBreak/>
+        <w:drawing>
+          <wp:inline distT="0" distB="0" distL="0" distR="0" wp14:anchorId="2ED02264" wp14:editId="5CB4AFA6">
+            <wp:extent cx="3572374" cy="695422"/>
+            <wp:effectExtent l="0" t="0" r="9525" b="9525"/>
+            <wp:docPr id="1419387707" name="Picture 1" descr="A math equation with numbers and symbols&#10;&#10;AI-generated content may be incorrect."/>
+            <wp:cNvGraphicFramePr>
+              <a:graphicFrameLocks xmlns:a="http://schemas.openxmlformats.org/drawingml/2006/main" noChangeAspect="1"/>
+            </wp:cNvGraphicFramePr>
+            <a:graphic xmlns:a="http://schemas.openxmlformats.org/drawingml/2006/main">
+              <a:graphicData uri="http://schemas.openxmlformats.org/drawingml/2006/picture">
+                <pic:pic xmlns:pic="http://schemas.openxmlformats.org/drawingml/2006/picture">
+                  <pic:nvPicPr>
+                    <pic:cNvPr id="1419387707" name="Picture 1" descr="A math equation with numbers and symbols&#10;&#10;AI-generated content may be incorrect."/>
+                    <pic:cNvPicPr/>
+                  </pic:nvPicPr>
+                  <pic:blipFill>
+                    <a:blip r:embed="rId10"/>
+                    <a:stretch>
+                      <a:fillRect/>
+                    </a:stretch>
+                  </pic:blipFill>
+                  <pic:spPr>
+                    <a:xfrm>
+                      <a:off x="0" y="0"/>
+                      <a:ext cx="3572374" cy="695422"/>
+                    </a:xfrm>
+                    <a:prstGeom prst="rect">
+                      <a:avLst/>
+                    </a:prstGeom>
+                  </pic:spPr>
+                </pic:pic>
+              </a:graphicData>
+            </a:graphic>
+          </wp:inline>
+        </w:drawing>
+      </w:r>
+    </w:p>
+    <w:p>
+      <w:r>
+        <w:rPr>
+          <w:noProof/>
+        </w:rPr>
         <w:drawing>
           <wp:inline distT="0" distB="0" distL="0" distR="0" wp14:anchorId="2078B110" wp14:editId="02004457">
             <wp:extent cx="5731510" cy="1359535"/>
@@ -175,7 +356,7 @@
                     <pic:cNvPicPr/>
                   </pic:nvPicPr>
                   <pic:blipFill>
-                    <a:blip r:embed="rId7"/>
+                    <a:blip r:embed="rId11"/>
                     <a:stretch>
                       <a:fillRect/>
                     </a:stretch>
@@ -198,12 +379,12 @@
     </w:p>
     <w:p>
       <w:pPr>
+        <w:pStyle w:val="Heading3"/>
         <w:rPr>
           <w:noProof/>
         </w:rPr>
       </w:pPr>
       <w:r>
-        <w:lastRenderedPageBreak/>
         <w:t>4.</w:t>
       </w:r>
       <w:r>
@@ -213,6 +394,9 @@
         <w:t xml:space="preserve"> </w:t>
       </w:r>
       <w:r>
+        <w:rPr>
+          <w:noProof/>
+        </w:rPr>
         <w:drawing>
           <wp:inline distT="0" distB="0" distL="0" distR="0" wp14:anchorId="6C51CAD3" wp14:editId="0894D48F">
             <wp:extent cx="5731510" cy="2643505"/>
@@ -229,7 +413,7 @@
                     <pic:cNvPicPr/>
                   </pic:nvPicPr>
                   <pic:blipFill>
-                    <a:blip r:embed="rId8"/>
+                    <a:blip r:embed="rId12"/>
                     <a:stretch>
                       <a:fillRect/>
                     </a:stretch>
@@ -260,11 +444,95 @@
         <w:rPr>
           <w:noProof/>
         </w:rPr>
+        <w:br w:type="page"/>
+      </w:r>
+    </w:p>
+    <w:p>
+      <w:pPr>
+        <w:pStyle w:val="Heading3"/>
+        <w:rPr>
+          <w:noProof/>
+        </w:rPr>
+      </w:pPr>
+      <w:r>
+        <w:rPr>
+          <w:noProof/>
+        </w:rPr>
+        <w:lastRenderedPageBreak/>
         <w:t>5.</w:t>
       </w:r>
-    </w:p>
-    <w:p>
-      <w:r>
+      <w:r>
+        <w:rPr>
+          <w:noProof/>
+        </w:rPr>
+        <w:t xml:space="preserve"> </w:t>
+      </w:r>
+    </w:p>
+    <w:p>
+      <w:pPr>
+        <w:rPr>
+          <w:noProof/>
+        </w:rPr>
+      </w:pPr>
+      <w:r>
+        <w:rPr>
+          <w:noProof/>
+        </w:rPr>
+        <w:t>Công thức</w:t>
+      </w:r>
+    </w:p>
+    <w:p>
+      <w:pPr>
+        <w:rPr>
+          <w:noProof/>
+        </w:rPr>
+      </w:pPr>
+      <w:r>
+        <w:rPr>
+          <w:noProof/>
+        </w:rPr>
+        <w:drawing>
+          <wp:inline distT="0" distB="0" distL="0" distR="0" wp14:anchorId="67AF8AE1" wp14:editId="5F9060AC">
+            <wp:extent cx="1105054" cy="533474"/>
+            <wp:effectExtent l="0" t="0" r="0" b="0"/>
+            <wp:docPr id="1352597126" name="Picture 1" descr="A group of black and white text&#10;&#10;AI-generated content may be incorrect."/>
+            <wp:cNvGraphicFramePr>
+              <a:graphicFrameLocks xmlns:a="http://schemas.openxmlformats.org/drawingml/2006/main" noChangeAspect="1"/>
+            </wp:cNvGraphicFramePr>
+            <a:graphic xmlns:a="http://schemas.openxmlformats.org/drawingml/2006/main">
+              <a:graphicData uri="http://schemas.openxmlformats.org/drawingml/2006/picture">
+                <pic:pic xmlns:pic="http://schemas.openxmlformats.org/drawingml/2006/picture">
+                  <pic:nvPicPr>
+                    <pic:cNvPr id="1352597126" name="Picture 1" descr="A group of black and white text&#10;&#10;AI-generated content may be incorrect."/>
+                    <pic:cNvPicPr/>
+                  </pic:nvPicPr>
+                  <pic:blipFill>
+                    <a:blip r:embed="rId13"/>
+                    <a:stretch>
+                      <a:fillRect/>
+                    </a:stretch>
+                  </pic:blipFill>
+                  <pic:spPr>
+                    <a:xfrm>
+                      <a:off x="0" y="0"/>
+                      <a:ext cx="1105054" cy="533474"/>
+                    </a:xfrm>
+                    <a:prstGeom prst="rect">
+                      <a:avLst/>
+                    </a:prstGeom>
+                  </pic:spPr>
+                </pic:pic>
+              </a:graphicData>
+            </a:graphic>
+          </wp:inline>
+        </w:drawing>
+      </w:r>
+    </w:p>
+    <w:p>
+      <w:r>
+        <w:rPr>
+          <w:noProof/>
+        </w:rPr>
         <w:drawing>
           <wp:inline distT="0" distB="0" distL="0" distR="0" wp14:anchorId="0B77B26E" wp14:editId="7A6F08D1">
             <wp:extent cx="3600953" cy="5144218"/>
@@ -281,7 +549,7 @@
                     <pic:cNvPicPr/>
                   </pic:nvPicPr>
                   <pic:blipFill>
-                    <a:blip r:embed="rId9"/>
+                    <a:blip r:embed="rId14"/>
                     <a:stretch>
                       <a:fillRect/>
                     </a:stretch>
@@ -303,7 +571,42 @@
       </w:r>
     </w:p>
     <w:p>
+      <w:r>
+        <w:rPr>
+          <w:b/>
+          <w:bCs/>
+        </w:rPr>
+        <w:t>=&gt;&gt;</w:t>
+      </w:r>
+      <w:r>
+        <w:rPr>
+          <w:b/>
+          <w:bCs/>
+        </w:rPr>
+        <w:t>CPI&lt;1</w:t>
+      </w:r>
+      <w:r>
+        <w:t xml:space="preserve"> (chi phí cao), </w:t>
+      </w:r>
+      <w:r>
+        <w:rPr>
+          <w:b/>
+          <w:bCs/>
+        </w:rPr>
+        <w:t>SPI&lt;1</w:t>
+      </w:r>
+      <w:r>
+        <w:t xml:space="preserve"> (chậm tiến độ)</w:t>
+      </w:r>
+    </w:p>
+    <w:p>
+      <w:r>
+        <w:br w:type="page"/>
+      </w:r>
+    </w:p>
+    <w:p>
       <w:pPr>
+        <w:pStyle w:val="Heading3"/>
         <w:rPr>
           <w:noProof/>
         </w:rPr>
@@ -319,6 +622,117 @@
         <w:t xml:space="preserve"> </w:t>
       </w:r>
       <w:r>
+        <w:rPr>
+          <w:noProof/>
+        </w:rPr>
+        <w:tab/>
+      </w:r>
+    </w:p>
+    <w:p>
+      <w:pPr>
+        <w:rPr>
+          <w:noProof/>
+        </w:rPr>
+      </w:pPr>
+      <w:r>
+        <w:rPr>
+          <w:noProof/>
+        </w:rPr>
+        <w:t>Công thức từng việc</w:t>
+      </w:r>
+    </w:p>
+    <w:p>
+      <w:pPr>
+        <w:rPr>
+          <w:noProof/>
+        </w:rPr>
+      </w:pPr>
+      <w:r>
+        <w:rPr>
+          <w:noProof/>
+        </w:rPr>
+        <w:drawing>
+          <wp:inline distT="0" distB="0" distL="0" distR="0" wp14:anchorId="277059A6" wp14:editId="5EB2EE1E">
+            <wp:extent cx="1209844" cy="581106"/>
+            <wp:effectExtent l="0" t="0" r="9525" b="9525"/>
+            <wp:docPr id="1969447593" name="Picture 1" descr="A black and white image of a mathematical equation&#10;&#10;AI-generated content may be incorrect."/>
+            <wp:cNvGraphicFramePr>
+              <a:graphicFrameLocks xmlns:a="http://schemas.openxmlformats.org/drawingml/2006/main" noChangeAspect="1"/>
+            </wp:cNvGraphicFramePr>
+            <a:graphic xmlns:a="http://schemas.openxmlformats.org/drawingml/2006/main">
+              <a:graphicData uri="http://schemas.openxmlformats.org/drawingml/2006/picture">
+                <pic:pic xmlns:pic="http://schemas.openxmlformats.org/drawingml/2006/picture">
+                  <pic:nvPicPr>
+                    <pic:cNvPr id="1969447593" name="Picture 1" descr="A black and white image of a mathematical equation&#10;&#10;AI-generated content may be incorrect."/>
+                    <pic:cNvPicPr/>
+                  </pic:nvPicPr>
+                  <pic:blipFill>
+                    <a:blip r:embed="rId15"/>
+                    <a:stretch>
+                      <a:fillRect/>
+                    </a:stretch>
+                  </pic:blipFill>
+                  <pic:spPr>
+                    <a:xfrm>
+                      <a:off x="0" y="0"/>
+                      <a:ext cx="1209844" cy="581106"/>
+                    </a:xfrm>
+                    <a:prstGeom prst="rect">
+                      <a:avLst/>
+                    </a:prstGeom>
+                  </pic:spPr>
+                </pic:pic>
+              </a:graphicData>
+            </a:graphic>
+          </wp:inline>
+        </w:drawing>
+      </w:r>
+    </w:p>
+    <w:p>
+      <w:pPr>
+        <w:rPr>
+          <w:noProof/>
+        </w:rPr>
+      </w:pPr>
+      <w:r>
+        <w:rPr>
+          <w:noProof/>
+        </w:rPr>
+        <w:t>Công thức dự án</w:t>
+      </w:r>
+    </w:p>
+    <w:p>
+      <w:pPr>
+        <w:ind w:firstLine="720"/>
+        <w:rPr>
+          <w:noProof/>
+        </w:rPr>
+      </w:pPr>
+      <w:r>
+        <w:rPr>
+          <w:b/>
+          <w:bCs/>
+          <w:noProof/>
+        </w:rPr>
+        <w:t>Thời gian hoàn thành ước tính</w:t>
+      </w:r>
+      <w:r>
+        <w:rPr>
+          <w:noProof/>
+        </w:rPr>
+        <w:t xml:space="preserve"> = =ThoiGianKeHoach / SPI</w:t>
+      </w:r>
+    </w:p>
+    <w:p>
+      <w:pPr>
+        <w:rPr>
+          <w:noProof/>
+        </w:rPr>
+      </w:pPr>
+      <w:r>
+        <w:rPr>
+          <w:noProof/>
+        </w:rPr>
         <w:drawing>
           <wp:inline distT="0" distB="0" distL="0" distR="0" wp14:anchorId="686C3D3D" wp14:editId="768EF89B">
             <wp:extent cx="5731510" cy="3183255"/>
@@ -335,7 +749,7 @@
                     <pic:cNvPicPr/>
                   </pic:nvPicPr>
                   <pic:blipFill>
-                    <a:blip r:embed="rId10"/>
+                    <a:blip r:embed="rId16"/>
                     <a:stretch>
                       <a:fillRect/>
                     </a:stretch>
@@ -359,23 +773,50 @@
     <w:p>
       <w:pPr>
         <w:rPr>
-          <w:noProof/>
+          <w:rFonts w:asciiTheme="majorHAnsi" w:eastAsiaTheme="majorEastAsia" w:hAnsiTheme="majorHAnsi" w:cstheme="majorBidi"/>
+          <w:noProof/>
+          <w:color w:val="2F5496" w:themeColor="accent1" w:themeShade="BF"/>
+          <w:sz w:val="32"/>
+          <w:szCs w:val="32"/>
         </w:rPr>
       </w:pPr>
       <w:r>
         <w:rPr>
           <w:noProof/>
         </w:rPr>
+        <w:br w:type="page"/>
+      </w:r>
+    </w:p>
+    <w:p>
+      <w:pPr>
+        <w:pStyle w:val="Heading2"/>
+        <w:rPr>
+          <w:noProof/>
+        </w:rPr>
+      </w:pPr>
+      <w:r>
+        <w:rPr>
+          <w:noProof/>
+        </w:rPr>
+        <w:lastRenderedPageBreak/>
         <w:t>III.</w:t>
       </w:r>
     </w:p>
     <w:p>
+      <w:pPr>
+        <w:pStyle w:val="Heading3"/>
+      </w:pPr>
+      <w:r>
+        <w:t>TÍNH NPV (GIÁ TRỊ HIỆN TẠI RÒNG)(thông số/giá trị giả)</w:t>
+      </w:r>
+    </w:p>
+    <w:p>
       <w:r>
         <w:drawing>
-          <wp:inline distT="0" distB="0" distL="0" distR="0" wp14:anchorId="3A33EDEE" wp14:editId="18FD6CE8">
-            <wp:extent cx="5731510" cy="1426210"/>
-            <wp:effectExtent l="0" t="0" r="2540" b="2540"/>
-            <wp:docPr id="372304284" name="Picture 1" descr="A screenshot of a computer&#10;&#10;AI-generated content may be incorrect."/>
+          <wp:inline distT="0" distB="0" distL="0" distR="0" wp14:anchorId="5C4EC10D" wp14:editId="3F67C79F">
+            <wp:extent cx="3496163" cy="1714739"/>
+            <wp:effectExtent l="0" t="0" r="9525" b="0"/>
+            <wp:docPr id="1726062452" name="Picture 1" descr="A table with numbers and text&#10;&#10;AI-generated content may be incorrect."/>
             <wp:cNvGraphicFramePr>
               <a:graphicFrameLocks xmlns:a="http://schemas.openxmlformats.org/drawingml/2006/main" noChangeAspect="1"/>
             </wp:cNvGraphicFramePr>
@@ -383,11 +824,11 @@
               <a:graphicData uri="http://schemas.openxmlformats.org/drawingml/2006/picture">
                 <pic:pic xmlns:pic="http://schemas.openxmlformats.org/drawingml/2006/picture">
                   <pic:nvPicPr>
-                    <pic:cNvPr id="372304284" name="Picture 1" descr="A screenshot of a computer&#10;&#10;AI-generated content may be incorrect."/>
+                    <pic:cNvPr id="1726062452" name="Picture 1" descr="A table with numbers and text&#10;&#10;AI-generated content may be incorrect."/>
                     <pic:cNvPicPr/>
                   </pic:nvPicPr>
                   <pic:blipFill>
-                    <a:blip r:embed="rId11"/>
+                    <a:blip r:embed="rId17"/>
                     <a:stretch>
                       <a:fillRect/>
                     </a:stretch>
@@ -395,7 +836,7 @@
                   <pic:spPr>
                     <a:xfrm>
                       <a:off x="0" y="0"/>
-                      <a:ext cx="5731510" cy="1426210"/>
+                      <a:ext cx="3496163" cy="1714739"/>
                     </a:xfrm>
                     <a:prstGeom prst="rect">
                       <a:avLst/>
@@ -411,10 +852,10 @@
     <w:p>
       <w:r>
         <w:drawing>
-          <wp:inline distT="0" distB="0" distL="0" distR="0" wp14:anchorId="6EF86662" wp14:editId="4B7B71FC">
-            <wp:extent cx="5731510" cy="1445895"/>
-            <wp:effectExtent l="0" t="0" r="2540" b="1905"/>
-            <wp:docPr id="2029799128" name="Picture 1" descr="A screenshot of a graph&#10;&#10;AI-generated content may be incorrect."/>
+          <wp:inline distT="0" distB="0" distL="0" distR="0" wp14:anchorId="7E25676A" wp14:editId="3FEB8D3E">
+            <wp:extent cx="3410426" cy="752580"/>
+            <wp:effectExtent l="0" t="0" r="0" b="9525"/>
+            <wp:docPr id="1203934294" name="Picture 1" descr="A math symbols and mathematical equations&#10;&#10;AI-generated content may be incorrect."/>
             <wp:cNvGraphicFramePr>
               <a:graphicFrameLocks xmlns:a="http://schemas.openxmlformats.org/drawingml/2006/main" noChangeAspect="1"/>
             </wp:cNvGraphicFramePr>
@@ -422,11 +863,11 @@
               <a:graphicData uri="http://schemas.openxmlformats.org/drawingml/2006/picture">
                 <pic:pic xmlns:pic="http://schemas.openxmlformats.org/drawingml/2006/picture">
                   <pic:nvPicPr>
-                    <pic:cNvPr id="2029799128" name="Picture 1" descr="A screenshot of a graph&#10;&#10;AI-generated content may be incorrect."/>
+                    <pic:cNvPr id="1203934294" name="Picture 1" descr="A math symbols and mathematical equations&#10;&#10;AI-generated content may be incorrect."/>
                     <pic:cNvPicPr/>
                   </pic:nvPicPr>
                   <pic:blipFill>
-                    <a:blip r:embed="rId12"/>
+                    <a:blip r:embed="rId18"/>
                     <a:stretch>
                       <a:fillRect/>
                     </a:stretch>
@@ -434,7 +875,7 @@
                   <pic:spPr>
                     <a:xfrm>
                       <a:off x="0" y="0"/>
-                      <a:ext cx="5731510" cy="1445895"/>
+                      <a:ext cx="3410426" cy="752580"/>
                     </a:xfrm>
                     <a:prstGeom prst="rect">
                       <a:avLst/>
@@ -448,12 +889,113 @@
       </w:r>
     </w:p>
     <w:p>
+      <w:pPr>
+        <w:rPr>
+          <w:b/>
+          <w:bCs/>
+        </w:rPr>
+      </w:pPr>
+      <w:r>
+        <w:t xml:space="preserve">Hàm NPV chỉ tính từ năm 1 → n, vì vậy phải </w:t>
+      </w:r>
+      <w:r>
+        <w:rPr>
+          <w:b/>
+          <w:bCs/>
+        </w:rPr>
+        <w:t xml:space="preserve">cộng thêm </w:t>
+      </w:r>
+      <w:r>
+        <w:rPr>
+          <w:b/>
+          <w:bCs/>
+        </w:rPr>
+        <w:t>CF0</w:t>
+      </w:r>
+    </w:p>
+    <w:p>
+      <w:r>
+        <w:rPr>
+          <w:b/>
+          <w:bCs/>
+        </w:rPr>
+        <w:t>=&gt;&gt;</w:t>
+      </w:r>
+      <w:r>
+        <w:rPr>
+          <w:b/>
+          <w:bCs/>
+        </w:rPr>
+        <w:t>NPV &gt; 0</w:t>
+      </w:r>
+      <w:r>
+        <w:t xml:space="preserve"> </w:t>
+      </w:r>
+      <w:r>
+        <w:rPr>
+          <w:rFonts w:ascii="Cambria Math" w:hAnsi="Cambria Math" w:cs="Cambria Math"/>
+        </w:rPr>
+        <w:t>⇒</w:t>
+      </w:r>
+      <w:r>
+        <w:t xml:space="preserve"> dự án </w:t>
+      </w:r>
+      <w:r>
+        <w:rPr>
+          <w:b/>
+          <w:bCs/>
+        </w:rPr>
+        <w:t>nên đầu tư</w:t>
+      </w:r>
+      <w:r>
+        <w:t xml:space="preserve">; </w:t>
+      </w:r>
+      <w:r>
+        <w:rPr>
+          <w:b/>
+          <w:bCs/>
+        </w:rPr>
+        <w:t>NPV &lt; 0</w:t>
+      </w:r>
+      <w:r>
+        <w:t xml:space="preserve"> </w:t>
+      </w:r>
+      <w:r>
+        <w:rPr>
+          <w:rFonts w:ascii="Cambria Math" w:hAnsi="Cambria Math" w:cs="Cambria Math"/>
+        </w:rPr>
+        <w:t>⇒</w:t>
+      </w:r>
+      <w:r>
+        <w:t xml:space="preserve"> </w:t>
+      </w:r>
+      <w:r>
+        <w:rPr>
+          <w:b/>
+          <w:bCs/>
+        </w:rPr>
+        <w:t>không nên</w:t>
+      </w:r>
+      <w:r>
+        <w:t>.</w:t>
+      </w:r>
+    </w:p>
+    <w:p/>
+    <w:p>
+      <w:pPr>
+        <w:pStyle w:val="Heading3"/>
+      </w:pPr>
+      <w:r>
+        <w:t>TÍNH ROI (TỶ SUẤT LỢI NHUẬN)(thông số/giá trị giả)</w:t>
+      </w:r>
+    </w:p>
+    <w:p>
       <w:r>
         <w:drawing>
-          <wp:inline distT="0" distB="0" distL="0" distR="0" wp14:anchorId="480A5DC6" wp14:editId="6115C508">
-            <wp:extent cx="4220164" cy="1524213"/>
-            <wp:effectExtent l="0" t="0" r="0" b="0"/>
-            <wp:docPr id="1076858909" name="Picture 1" descr="A white grid with black text and numbers&#10;&#10;AI-generated content may be incorrect."/>
+          <wp:inline distT="0" distB="0" distL="0" distR="0" wp14:anchorId="6AC0D234" wp14:editId="60C7BB8E">
+            <wp:extent cx="4544059" cy="657317"/>
+            <wp:effectExtent l="0" t="0" r="0" b="9525"/>
+            <wp:docPr id="827276007" name="Picture 1" descr="A black text on a white background&#10;&#10;AI-generated content may be incorrect."/>
             <wp:cNvGraphicFramePr>
               <a:graphicFrameLocks xmlns:a="http://schemas.openxmlformats.org/drawingml/2006/main" noChangeAspect="1"/>
             </wp:cNvGraphicFramePr>
@@ -461,11 +1003,11 @@
               <a:graphicData uri="http://schemas.openxmlformats.org/drawingml/2006/picture">
                 <pic:pic xmlns:pic="http://schemas.openxmlformats.org/drawingml/2006/picture">
                   <pic:nvPicPr>
-                    <pic:cNvPr id="1076858909" name="Picture 1" descr="A white grid with black text and numbers&#10;&#10;AI-generated content may be incorrect."/>
+                    <pic:cNvPr id="827276007" name="Picture 1" descr="A black text on a white background&#10;&#10;AI-generated content may be incorrect."/>
                     <pic:cNvPicPr/>
                   </pic:nvPicPr>
                   <pic:blipFill>
-                    <a:blip r:embed="rId13"/>
+                    <a:blip r:embed="rId19"/>
                     <a:stretch>
                       <a:fillRect/>
                     </a:stretch>
@@ -473,7 +1015,414 @@
                   <pic:spPr>
                     <a:xfrm>
                       <a:off x="0" y="0"/>
-                      <a:ext cx="4220164" cy="1524213"/>
+                      <a:ext cx="4544059" cy="657317"/>
+                    </a:xfrm>
+                    <a:prstGeom prst="rect">
+                      <a:avLst/>
+                    </a:prstGeom>
+                  </pic:spPr>
+                </pic:pic>
+              </a:graphicData>
+            </a:graphic>
+          </wp:inline>
+        </w:drawing>
+      </w:r>
+    </w:p>
+    <w:p>
+      <w:r>
+        <w:drawing>
+          <wp:inline distT="0" distB="0" distL="0" distR="0" wp14:anchorId="47454A11" wp14:editId="0A7C8285">
+            <wp:extent cx="3191320" cy="1781424"/>
+            <wp:effectExtent l="0" t="0" r="0" b="9525"/>
+            <wp:docPr id="1847712391" name="Picture 1" descr="A white grid with black text&#10;&#10;AI-generated content may be incorrect."/>
+            <wp:cNvGraphicFramePr>
+              <a:graphicFrameLocks xmlns:a="http://schemas.openxmlformats.org/drawingml/2006/main" noChangeAspect="1"/>
+            </wp:cNvGraphicFramePr>
+            <a:graphic xmlns:a="http://schemas.openxmlformats.org/drawingml/2006/main">
+              <a:graphicData uri="http://schemas.openxmlformats.org/drawingml/2006/picture">
+                <pic:pic xmlns:pic="http://schemas.openxmlformats.org/drawingml/2006/picture">
+                  <pic:nvPicPr>
+                    <pic:cNvPr id="1847712391" name="Picture 1" descr="A white grid with black text&#10;&#10;AI-generated content may be incorrect."/>
+                    <pic:cNvPicPr/>
+                  </pic:nvPicPr>
+                  <pic:blipFill>
+                    <a:blip r:embed="rId20"/>
+                    <a:stretch>
+                      <a:fillRect/>
+                    </a:stretch>
+                  </pic:blipFill>
+                  <pic:spPr>
+                    <a:xfrm>
+                      <a:off x="0" y="0"/>
+                      <a:ext cx="3191320" cy="1781424"/>
+                    </a:xfrm>
+                    <a:prstGeom prst="rect">
+                      <a:avLst/>
+                    </a:prstGeom>
+                  </pic:spPr>
+                </pic:pic>
+              </a:graphicData>
+            </a:graphic>
+          </wp:inline>
+        </w:drawing>
+      </w:r>
+    </w:p>
+    <w:p>
+      <w:r>
+        <w:t xml:space="preserve">ROI &gt; 0 (ví dụ 0,64 = 64%) nghĩa là </w:t>
+      </w:r>
+      <w:r>
+        <w:rPr>
+          <w:b/>
+          <w:bCs/>
+        </w:rPr>
+        <w:t>có lời</w:t>
+      </w:r>
+      <w:r>
+        <w:t xml:space="preserve">; ROI = 0 hòa vốn; ROI &lt; 0 </w:t>
+      </w:r>
+      <w:r>
+        <w:rPr>
+          <w:b/>
+          <w:bCs/>
+        </w:rPr>
+        <w:t>lỗ</w:t>
+      </w:r>
+    </w:p>
+    <w:p>
+      <w:pPr>
+        <w:pStyle w:val="Heading3"/>
+      </w:pPr>
+      <w:r>
+        <w:t>TÌM ĐIỂM HOÀ VỐN (PAYBACK)(thông số/giá trị giả)</w:t>
+      </w:r>
+    </w:p>
+    <w:p>
+      <w:r>
+        <w:drawing>
+          <wp:inline distT="0" distB="0" distL="0" distR="0" wp14:anchorId="34D20B12" wp14:editId="7F816F2C">
+            <wp:extent cx="4382112" cy="714475"/>
+            <wp:effectExtent l="0" t="0" r="0" b="9525"/>
+            <wp:docPr id="1130787913" name="Picture 1" descr="A math equation with numbers&#10;&#10;AI-generated content may be incorrect."/>
+            <wp:cNvGraphicFramePr>
+              <a:graphicFrameLocks xmlns:a="http://schemas.openxmlformats.org/drawingml/2006/main" noChangeAspect="1"/>
+            </wp:cNvGraphicFramePr>
+            <a:graphic xmlns:a="http://schemas.openxmlformats.org/drawingml/2006/main">
+              <a:graphicData uri="http://schemas.openxmlformats.org/drawingml/2006/picture">
+                <pic:pic xmlns:pic="http://schemas.openxmlformats.org/drawingml/2006/picture">
+                  <pic:nvPicPr>
+                    <pic:cNvPr id="1130787913" name="Picture 1" descr="A math equation with numbers&#10;&#10;AI-generated content may be incorrect."/>
+                    <pic:cNvPicPr/>
+                  </pic:nvPicPr>
+                  <pic:blipFill>
+                    <a:blip r:embed="rId21"/>
+                    <a:stretch>
+                      <a:fillRect/>
+                    </a:stretch>
+                  </pic:blipFill>
+                  <pic:spPr>
+                    <a:xfrm>
+                      <a:off x="0" y="0"/>
+                      <a:ext cx="4382112" cy="714475"/>
+                    </a:xfrm>
+                    <a:prstGeom prst="rect">
+                      <a:avLst/>
+                    </a:prstGeom>
+                  </pic:spPr>
+                </pic:pic>
+              </a:graphicData>
+            </a:graphic>
+          </wp:inline>
+        </w:drawing>
+      </w:r>
+    </w:p>
+    <w:p>
+      <w:r>
+        <w:lastRenderedPageBreak/>
+        <w:drawing>
+          <wp:inline distT="0" distB="0" distL="0" distR="0" wp14:anchorId="17DED20F" wp14:editId="1519BB2D">
+            <wp:extent cx="3219899" cy="1867161"/>
+            <wp:effectExtent l="0" t="0" r="0" b="0"/>
+            <wp:docPr id="1169680141" name="Picture 1" descr="A white paper with black text and numbers&#10;&#10;AI-generated content may be incorrect."/>
+            <wp:cNvGraphicFramePr>
+              <a:graphicFrameLocks xmlns:a="http://schemas.openxmlformats.org/drawingml/2006/main" noChangeAspect="1"/>
+            </wp:cNvGraphicFramePr>
+            <a:graphic xmlns:a="http://schemas.openxmlformats.org/drawingml/2006/main">
+              <a:graphicData uri="http://schemas.openxmlformats.org/drawingml/2006/picture">
+                <pic:pic xmlns:pic="http://schemas.openxmlformats.org/drawingml/2006/picture">
+                  <pic:nvPicPr>
+                    <pic:cNvPr id="1169680141" name="Picture 1" descr="A white paper with black text and numbers&#10;&#10;AI-generated content may be incorrect."/>
+                    <pic:cNvPicPr/>
+                  </pic:nvPicPr>
+                  <pic:blipFill>
+                    <a:blip r:embed="rId22"/>
+                    <a:stretch>
+                      <a:fillRect/>
+                    </a:stretch>
+                  </pic:blipFill>
+                  <pic:spPr>
+                    <a:xfrm>
+                      <a:off x="0" y="0"/>
+                      <a:ext cx="3219899" cy="1867161"/>
+                    </a:xfrm>
+                    <a:prstGeom prst="rect">
+                      <a:avLst/>
+                    </a:prstGeom>
+                  </pic:spPr>
+                </pic:pic>
+              </a:graphicData>
+            </a:graphic>
+          </wp:inline>
+        </w:drawing>
+      </w:r>
+    </w:p>
+    <w:p>
+      <w:r>
+        <w:t xml:space="preserve">Tìm hàng đầu tiên lũy kế ≥ 0 </w:t>
+      </w:r>
+      <w:r>
+        <w:rPr>
+          <w:rFonts w:ascii="Cambria Math" w:hAnsi="Cambria Math" w:cs="Cambria Math"/>
+        </w:rPr>
+        <w:t>⇒</w:t>
+      </w:r>
+      <w:r>
+        <w:t xml:space="preserve"> h</w:t>
+      </w:r>
+      <w:r>
+        <w:rPr>
+          <w:rFonts w:ascii="Arial" w:hAnsi="Arial" w:cs="Arial"/>
+        </w:rPr>
+        <w:t>ò</w:t>
+      </w:r>
+      <w:r>
+        <w:t>a vốn trong năm đó.</w:t>
+      </w:r>
+    </w:p>
+    <w:p>
+      <w:r>
+        <w:t xml:space="preserve">Lấy phần còn thiếu / CF của năm hòa vốn </w:t>
+      </w:r>
+      <w:r>
+        <w:t>suy ra 2.5</w:t>
+      </w:r>
+      <w:r>
+        <w:t xml:space="preserve"> năm.</w:t>
+      </w:r>
+    </w:p>
+    <w:p>
+      <w:pPr>
+        <w:pStyle w:val="Heading3"/>
+      </w:pPr>
+      <w:r>
+        <w:t>EVM – Quản lý hiệu quả dự án (2 tháng)</w:t>
+      </w:r>
+    </w:p>
+    <w:p>
+      <w:r>
+        <w:t xml:space="preserve">Công thức chỉ số: </w:t>
+      </w:r>
+    </w:p>
+    <w:p>
+      <w:r>
+        <w:t>CV = EV − AC</w:t>
+      </w:r>
+    </w:p>
+    <w:p>
+      <w:r>
+        <w:t>SV = EV − PV</w:t>
+      </w:r>
+    </w:p>
+    <w:p>
+      <w:r>
+        <w:t>CPI = EV / AC</w:t>
+      </w:r>
+    </w:p>
+    <w:p>
+      <w:r>
+        <w:t>SPI = EV / PV</w:t>
+      </w:r>
+    </w:p>
+    <w:p>
+      <w:r>
+        <w:t>EAC ≈ BAC / CPI</w:t>
+      </w:r>
+    </w:p>
+    <w:p>
+      <w:r>
+        <w:t>VAC = BAC − EAC</w:t>
+      </w:r>
+    </w:p>
+    <w:p>
+      <w:r>
+        <w:drawing>
+          <wp:inline distT="0" distB="0" distL="0" distR="0" wp14:anchorId="50D2DC18" wp14:editId="4E05690F">
+            <wp:extent cx="5731510" cy="3108960"/>
+            <wp:effectExtent l="0" t="0" r="2540" b="0"/>
+            <wp:docPr id="483367085" name="Picture 1" descr="A white grid with black text&#10;&#10;AI-generated content may be incorrect."/>
+            <wp:cNvGraphicFramePr>
+              <a:graphicFrameLocks xmlns:a="http://schemas.openxmlformats.org/drawingml/2006/main" noChangeAspect="1"/>
+            </wp:cNvGraphicFramePr>
+            <a:graphic xmlns:a="http://schemas.openxmlformats.org/drawingml/2006/main">
+              <a:graphicData uri="http://schemas.openxmlformats.org/drawingml/2006/picture">
+                <pic:pic xmlns:pic="http://schemas.openxmlformats.org/drawingml/2006/picture">
+                  <pic:nvPicPr>
+                    <pic:cNvPr id="483367085" name="Picture 1" descr="A white grid with black text&#10;&#10;AI-generated content may be incorrect."/>
+                    <pic:cNvPicPr/>
+                  </pic:nvPicPr>
+                  <pic:blipFill>
+                    <a:blip r:embed="rId23"/>
+                    <a:stretch>
+                      <a:fillRect/>
+                    </a:stretch>
+                  </pic:blipFill>
+                  <pic:spPr>
+                    <a:xfrm>
+                      <a:off x="0" y="0"/>
+                      <a:ext cx="5731510" cy="3108960"/>
+                    </a:xfrm>
+                    <a:prstGeom prst="rect">
+                      <a:avLst/>
+                    </a:prstGeom>
+                  </pic:spPr>
+                </pic:pic>
+              </a:graphicData>
+            </a:graphic>
+          </wp:inline>
+        </w:drawing>
+      </w:r>
+    </w:p>
+    <w:p>
+      <w:r>
+        <w:t xml:space="preserve">CPI &lt; 1 </w:t>
+      </w:r>
+      <w:r>
+        <w:rPr>
+          <w:rFonts w:ascii="Cambria Math" w:hAnsi="Cambria Math" w:cs="Cambria Math"/>
+        </w:rPr>
+        <w:t>⇒</w:t>
+      </w:r>
+      <w:r>
+        <w:t xml:space="preserve"> vượt chi phí; CPI &gt; 1 </w:t>
+      </w:r>
+      <w:r>
+        <w:rPr>
+          <w:rFonts w:ascii="Cambria Math" w:hAnsi="Cambria Math" w:cs="Cambria Math"/>
+        </w:rPr>
+        <w:t>⇒</w:t>
+      </w:r>
+      <w:r>
+        <w:t xml:space="preserve"> tiết kiệm.</w:t>
+      </w:r>
+    </w:p>
+    <w:p>
+      <w:r>
+        <w:t xml:space="preserve">SPI &lt; 1 </w:t>
+      </w:r>
+      <w:r>
+        <w:rPr>
+          <w:rFonts w:ascii="Cambria Math" w:hAnsi="Cambria Math" w:cs="Cambria Math"/>
+        </w:rPr>
+        <w:t>⇒</w:t>
+      </w:r>
+      <w:r>
+        <w:t xml:space="preserve"> chậm tiến độ; SPI &gt; 1 </w:t>
+      </w:r>
+      <w:r>
+        <w:rPr>
+          <w:rFonts w:ascii="Cambria Math" w:hAnsi="Cambria Math" w:cs="Cambria Math"/>
+        </w:rPr>
+        <w:t>⇒</w:t>
+      </w:r>
+      <w:r>
+        <w:t xml:space="preserve"> nhanh h</w:t>
+      </w:r>
+      <w:r>
+        <w:rPr>
+          <w:rFonts w:ascii="Arial" w:hAnsi="Arial" w:cs="Arial"/>
+        </w:rPr>
+        <w:t>ơ</w:t>
+      </w:r>
+      <w:r>
+        <w:t>n kế hoạch.</w:t>
+      </w:r>
+    </w:p>
+    <w:p/>
+    <w:p/>
+    <w:p>
+      <w:pPr>
+        <w:pStyle w:val="Heading3"/>
+      </w:pPr>
+      <w:r>
+        <w:t>Ước lượng thời gian hoàn thành</w:t>
+      </w:r>
+    </w:p>
+    <w:p>
+      <w:r>
+        <w:drawing>
+          <wp:inline distT="0" distB="0" distL="0" distR="0" wp14:anchorId="54A0BE95" wp14:editId="0F421EDA">
+            <wp:extent cx="4763165" cy="685896"/>
+            <wp:effectExtent l="0" t="0" r="0" b="0"/>
+            <wp:docPr id="1553697988" name="Picture 1" descr="A black text on a white background&#10;&#10;AI-generated content may be incorrect."/>
+            <wp:cNvGraphicFramePr>
+              <a:graphicFrameLocks xmlns:a="http://schemas.openxmlformats.org/drawingml/2006/main" noChangeAspect="1"/>
+            </wp:cNvGraphicFramePr>
+            <a:graphic xmlns:a="http://schemas.openxmlformats.org/drawingml/2006/main">
+              <a:graphicData uri="http://schemas.openxmlformats.org/drawingml/2006/picture">
+                <pic:pic xmlns:pic="http://schemas.openxmlformats.org/drawingml/2006/picture">
+                  <pic:nvPicPr>
+                    <pic:cNvPr id="1553697988" name="Picture 1" descr="A black text on a white background&#10;&#10;AI-generated content may be incorrect."/>
+                    <pic:cNvPicPr/>
+                  </pic:nvPicPr>
+                  <pic:blipFill>
+                    <a:blip r:embed="rId24"/>
+                    <a:stretch>
+                      <a:fillRect/>
+                    </a:stretch>
+                  </pic:blipFill>
+                  <pic:spPr>
+                    <a:xfrm>
+                      <a:off x="0" y="0"/>
+                      <a:ext cx="4763165" cy="685896"/>
+                    </a:xfrm>
+                    <a:prstGeom prst="rect">
+                      <a:avLst/>
+                    </a:prstGeom>
+                  </pic:spPr>
+                </pic:pic>
+              </a:graphicData>
+            </a:graphic>
+          </wp:inline>
+        </w:drawing>
+      </w:r>
+    </w:p>
+    <w:p>
+      <w:r>
+        <w:drawing>
+          <wp:inline distT="0" distB="0" distL="0" distR="0" wp14:anchorId="6F5C6101" wp14:editId="0C702FA1">
+            <wp:extent cx="5731510" cy="586105"/>
+            <wp:effectExtent l="0" t="0" r="2540" b="4445"/>
+            <wp:docPr id="1860634901" name="Picture 1" descr="A close up of a logo&#10;&#10;AI-generated content may be incorrect."/>
+            <wp:cNvGraphicFramePr>
+              <a:graphicFrameLocks xmlns:a="http://schemas.openxmlformats.org/drawingml/2006/main" noChangeAspect="1"/>
+            </wp:cNvGraphicFramePr>
+            <a:graphic xmlns:a="http://schemas.openxmlformats.org/drawingml/2006/main">
+              <a:graphicData uri="http://schemas.openxmlformats.org/drawingml/2006/picture">
+                <pic:pic xmlns:pic="http://schemas.openxmlformats.org/drawingml/2006/picture">
+                  <pic:nvPicPr>
+                    <pic:cNvPr id="1860634901" name="Picture 1" descr="A close up of a logo&#10;&#10;AI-generated content may be incorrect."/>
+                    <pic:cNvPicPr/>
+                  </pic:nvPicPr>
+                  <pic:blipFill>
+                    <a:blip r:embed="rId25"/>
+                    <a:stretch>
+                      <a:fillRect/>
+                    </a:stretch>
+                  </pic:blipFill>
+                  <pic:spPr>
+                    <a:xfrm>
+                      <a:off x="0" y="0"/>
+                      <a:ext cx="5731510" cy="586105"/>
                     </a:xfrm>
                     <a:prstGeom prst="rect">
                       <a:avLst/>
@@ -1100,7 +2049,6 @@
   <w:style w:type="character" w:default="1" w:styleId="DefaultParagraphFont">
     <w:name w:val="Default Paragraph Font"/>
     <w:uiPriority w:val="1"/>
-    <w:semiHidden/>
     <w:unhideWhenUsed/>
   </w:style>
   <w:style w:type="table" w:default="1" w:styleId="TableNormal">
@@ -1710,4 +2658,16 @@
     </a:ext>
   </a:extLst>
 </a:theme>
+</file>
+
+<file path=customXml/item1.xml><?xml version="1.0" encoding="utf-8"?>
+<b:Sources xmlns:b="http://schemas.openxmlformats.org/officeDocument/2006/bibliography" xmlns="http://schemas.openxmlformats.org/officeDocument/2006/bibliography" SelectedStyle="\APASixthEditionOfficeOnline.xsl" StyleName="APA" Version="6"/>
+</file>
+
+<file path=customXml/itemProps1.xml><?xml version="1.0" encoding="utf-8"?>
+<ds:datastoreItem xmlns:ds="http://schemas.openxmlformats.org/officeDocument/2006/customXml" ds:itemID="{BA0FA2B7-667C-4474-BA1D-656039E5B0BA}">
+  <ds:schemaRefs>
+    <ds:schemaRef ds:uri="http://schemas.openxmlformats.org/officeDocument/2006/bibliography"/>
+  </ds:schemaRefs>
+</ds:datastoreItem>
 </file>
</xml_diff>